<commit_message>
Update seed journey website
</commit_message>
<xml_diff>
--- a/说明文档-readme.docx
+++ b/说明文档-readme.docx
@@ -44,7 +44,6 @@
           <w:sz w:val="24"/>
         </w:rPr>
       </w:pPr>
-      <w:proofErr w:type="gramStart"/>
       <w:r>
         <w:rPr>
           <w:rFonts w:ascii="宋体" w:eastAsia="宋体" w:hAnsi="宋体"/>
@@ -59,7 +58,6 @@
         </w:rPr>
         <w:t>“</w:t>
       </w:r>
-      <w:proofErr w:type="gramEnd"/>
       <w:r>
         <w:rPr>
           <w:rFonts w:ascii="宋体" w:eastAsia="宋体" w:hAnsi="宋体"/>
@@ -102,70 +100,22 @@
     <w:p>
       <w:pPr>
         <w:rPr>
+          <w:rFonts w:ascii="宋体" w:eastAsia="宋体" w:hAnsi="宋体" w:hint="eastAsia"/>
+          <w:sz w:val="24"/>
+        </w:rPr>
+      </w:pPr>
+      <w:r>
+        <w:rPr>
           <w:rFonts w:ascii="宋体" w:eastAsia="宋体" w:hAnsi="宋体"/>
           <w:sz w:val="24"/>
         </w:rPr>
-      </w:pPr>
-      <w:r>
-        <w:rPr>
-          <w:rFonts w:ascii="宋体" w:eastAsia="宋体" w:hAnsi="宋体"/>
-          <w:sz w:val="24"/>
-        </w:rPr>
-        <w:t>向下滚动：完整</w:t>
-      </w:r>
-      <w:proofErr w:type="gramStart"/>
-      <w:r>
-        <w:rPr>
-          <w:rFonts w:ascii="宋体" w:eastAsia="宋体" w:hAnsi="宋体"/>
-          <w:sz w:val="24"/>
-        </w:rPr>
-        <w:t xml:space="preserve">蒲公英 → </w:t>
-      </w:r>
-      <w:proofErr w:type="gramEnd"/>
-      <w:r>
-        <w:rPr>
-          <w:rFonts w:ascii="宋体" w:eastAsia="宋体" w:hAnsi="宋体"/>
-          <w:sz w:val="24"/>
-        </w:rPr>
-        <w:t>风起、数粒种子</w:t>
-      </w:r>
-      <w:proofErr w:type="gramStart"/>
-      <w:r>
-        <w:rPr>
-          <w:rFonts w:ascii="宋体" w:eastAsia="宋体" w:hAnsi="宋体"/>
-          <w:sz w:val="24"/>
-        </w:rPr>
-        <w:t xml:space="preserve">离开 → </w:t>
-      </w:r>
-      <w:proofErr w:type="gramEnd"/>
-      <w:r>
-        <w:rPr>
-          <w:rFonts w:ascii="宋体" w:eastAsia="宋体" w:hAnsi="宋体"/>
-          <w:sz w:val="24"/>
-        </w:rPr>
-        <w:t>镜头聚焦其中一</w:t>
-      </w:r>
-      <w:proofErr w:type="gramStart"/>
-      <w:r>
-        <w:rPr>
-          <w:rFonts w:ascii="宋体" w:eastAsia="宋体" w:hAnsi="宋体"/>
-          <w:sz w:val="24"/>
-        </w:rPr>
-        <w:t xml:space="preserve">粒 → 漂浮 → 落地 → </w:t>
-      </w:r>
-      <w:proofErr w:type="gramEnd"/>
-      <w:r>
-        <w:rPr>
-          <w:rFonts w:ascii="宋体" w:eastAsia="宋体" w:hAnsi="宋体"/>
-          <w:sz w:val="24"/>
-        </w:rPr>
-        <w:t>新生。</w:t>
+        <w:t>向下滚动：完整蒲公英 → 风起、数粒种子离开 → 镜头聚焦其中一粒 → 漂浮 → 落地 → 新生。</w:t>
       </w:r>
     </w:p>
     <w:p>
       <w:pPr>
         <w:rPr>
-          <w:rFonts w:ascii="宋体" w:eastAsia="宋体" w:hAnsi="宋体"/>
+          <w:rFonts w:ascii="宋体" w:eastAsia="宋体" w:hAnsi="宋体" w:hint="eastAsia"/>
           <w:sz w:val="24"/>
         </w:rPr>
       </w:pPr>
@@ -180,7 +130,7 @@
     <w:p>
       <w:pPr>
         <w:rPr>
-          <w:rFonts w:ascii="宋体" w:eastAsia="宋体" w:hAnsi="宋体"/>
+          <w:rFonts w:ascii="宋体" w:eastAsia="宋体" w:hAnsi="宋体" w:hint="eastAsia"/>
           <w:sz w:val="24"/>
         </w:rPr>
       </w:pPr>
@@ -195,7 +145,7 @@
     <w:p>
       <w:pPr>
         <w:rPr>
-          <w:rFonts w:ascii="宋体" w:eastAsia="宋体" w:hAnsi="宋体"/>
+          <w:rFonts w:ascii="宋体" w:eastAsia="宋体" w:hAnsi="宋体" w:hint="eastAsia"/>
           <w:sz w:val="24"/>
         </w:rPr>
       </w:pPr>
@@ -210,94 +160,90 @@
     <w:p>
       <w:pPr>
         <w:rPr>
+          <w:rFonts w:ascii="宋体" w:eastAsia="宋体" w:hAnsi="宋体" w:hint="eastAsia"/>
+          <w:sz w:val="24"/>
+        </w:rPr>
+      </w:pPr>
+      <w:r>
+        <w:rPr>
           <w:rFonts w:ascii="宋体" w:eastAsia="宋体" w:hAnsi="宋体"/>
           <w:sz w:val="24"/>
         </w:rPr>
-      </w:pPr>
-      <w:r>
-        <w:rPr>
-          <w:rFonts w:ascii="宋体" w:eastAsia="宋体" w:hAnsi="宋体"/>
-          <w:sz w:val="24"/>
-        </w:rPr>
-        <w:t>科学手记：右上角书页按钮打开本地阅读面板，包含出发、乘风、落地、新生四篇图文。默认选中当前场景对应篇章，所有内容与示意图均可离线查看，没有外部跳转。</w:t>
+        <w:t>科学手记：右上角书页按钮打开本地阅读面板，包含出发、乘风、落地、新生四篇图文。默认选中当前场景对应篇章</w:t>
+      </w:r>
+      <w:r>
+        <w:rPr>
+          <w:rFonts w:ascii="宋体" w:eastAsia="宋体" w:hAnsi="宋体" w:hint="eastAsia"/>
+          <w:sz w:val="24"/>
+        </w:rPr>
+        <w:t>。</w:t>
       </w:r>
     </w:p>
     <w:p>
       <w:pPr>
         <w:rPr>
+          <w:rFonts w:ascii="宋体" w:eastAsia="宋体" w:hAnsi="宋体" w:hint="eastAsia"/>
+          <w:sz w:val="24"/>
+        </w:rPr>
+      </w:pPr>
+      <w:r>
+        <w:rPr>
           <w:rFonts w:ascii="宋体" w:eastAsia="宋体" w:hAnsi="宋体"/>
           <w:sz w:val="24"/>
         </w:rPr>
-      </w:pPr>
-      <w:r>
-        <w:rPr>
-          <w:rFonts w:ascii="宋体" w:eastAsia="宋体" w:hAnsi="宋体"/>
-          <w:sz w:val="24"/>
-        </w:rPr>
-        <w:t>阅读手记时背景画面自动暂停；点击关闭、继续这段旅行或按 Esc 返回，保留原阅读位置并恢复微动。已移除手动</w:t>
-      </w:r>
-      <w:proofErr w:type="gramStart"/>
-      <w:r>
-        <w:rPr>
-          <w:rFonts w:ascii="宋体" w:eastAsia="宋体" w:hAnsi="宋体"/>
-          <w:sz w:val="24"/>
-        </w:rPr>
-        <w:t>暂停／</w:t>
-      </w:r>
-      <w:proofErr w:type="gramEnd"/>
-      <w:r>
-        <w:rPr>
-          <w:rFonts w:ascii="宋体" w:eastAsia="宋体" w:hAnsi="宋体"/>
-          <w:sz w:val="24"/>
-        </w:rPr>
-        <w:t>恢复微动按钮。</w:t>
+        <w:t>阅读手记时背景画面自动暂停；点击关闭、继续这段旅行或按 Esc 返回，保留原阅读位置并恢复微动。</w:t>
       </w:r>
     </w:p>
     <w:p>
       <w:pPr>
         <w:rPr>
+          <w:rFonts w:ascii="宋体" w:eastAsia="宋体" w:hAnsi="宋体" w:hint="eastAsia"/>
+          <w:sz w:val="24"/>
+        </w:rPr>
+      </w:pPr>
+      <w:r>
+        <w:rPr>
           <w:rFonts w:ascii="宋体" w:eastAsia="宋体" w:hAnsi="宋体"/>
           <w:sz w:val="24"/>
         </w:rPr>
-      </w:pPr>
-      <w:r>
-        <w:rPr>
-          <w:rFonts w:ascii="宋体" w:eastAsia="宋体" w:hAnsi="宋体"/>
-          <w:sz w:val="24"/>
-        </w:rPr>
-        <w:t>手记篇章支持鼠标、触屏以及左右方向键切换，Home / End 可选中首</w:t>
-      </w:r>
-      <w:proofErr w:type="gramStart"/>
-      <w:r>
-        <w:rPr>
-          <w:rFonts w:ascii="宋体" w:eastAsia="宋体" w:hAnsi="宋体"/>
-          <w:sz w:val="24"/>
-        </w:rPr>
-        <w:t>篇／</w:t>
-      </w:r>
-      <w:proofErr w:type="gramEnd"/>
-      <w:r>
-        <w:rPr>
-          <w:rFonts w:ascii="宋体" w:eastAsia="宋体" w:hAnsi="宋体"/>
-          <w:sz w:val="24"/>
-        </w:rPr>
-        <w:t>末篇。</w:t>
+        <w:t>手记篇章支持鼠标、触屏以及左右方向键切换，Home / End 可选中首篇／末篇。</w:t>
       </w:r>
     </w:p>
     <w:p>
       <w:pPr>
         <w:rPr>
-          <w:rFonts w:ascii="宋体" w:eastAsia="宋体" w:hAnsi="宋体" w:hint="eastAsia"/>
-          <w:sz w:val="24"/>
-        </w:rPr>
-      </w:pPr>
-      <w:r>
-        <w:rPr>
           <w:rFonts w:ascii="宋体" w:eastAsia="宋体" w:hAnsi="宋体"/>
           <w:sz w:val="24"/>
         </w:rPr>
+      </w:pPr>
+      <w:r>
+        <w:rPr>
+          <w:rFonts w:ascii="宋体" w:eastAsia="宋体" w:hAnsi="宋体"/>
+          <w:sz w:val="24"/>
+        </w:rPr>
         <w:t>系统设置“减少动态效果”时：关闭微动，章节跳转取消平滑滚动。</w:t>
       </w:r>
+    </w:p>
+    <w:p>
+      <w:pPr>
+        <w:rPr>
+          <w:rFonts w:hint="eastAsia"/>
+        </w:rPr>
+      </w:pPr>
+      <w:r>
+        <w:rPr>
+          <w:rFonts w:hint="eastAsia"/>
+        </w:rPr>
+        <w:t>Github:</w:t>
+      </w:r>
+      <w:hyperlink r:id="rId6" w:history="1">
+        <w:r>
+          <w:rPr>
+            <w:rStyle w:val="af2"/>
+          </w:rPr>
+          <w:t>https://github.com/PerryPali/seed-journey</w:t>
+        </w:r>
+      </w:hyperlink>
     </w:p>
     <w:sectPr>
       <w:pgSz w:w="11906" w:h="16838"/>
@@ -307,6 +253,68 @@
     </w:sectPr>
   </w:body>
 </w:document>
+</file>
+
+<file path=word/endnotes.xml><?xml version="1.0" encoding="utf-8"?>
+<w:endnotes xmlns:wpc="http://schemas.microsoft.com/office/word/2010/wordprocessingCanvas" xmlns:cx="http://schemas.microsoft.com/office/drawing/2014/chartex" xmlns:cx1="http://schemas.microsoft.com/office/drawing/2015/9/8/chartex" xmlns:cx2="http://schemas.microsoft.com/office/drawing/2015/10/21/chartex" xmlns:cx3="http://schemas.microsoft.com/office/drawing/2016/5/9/chartex" xmlns:cx4="http://schemas.microsoft.com/office/drawing/2016/5/10/chartex" xmlns:cx5="http://schemas.microsoft.com/office/drawing/2016/5/11/chartex" xmlns:cx6="http://schemas.microsoft.com/office/drawing/2016/5/12/chartex" xmlns:cx7="http://schemas.microsoft.com/office/drawing/2016/5/13/chartex" xmlns:cx8="http://schemas.microsoft.com/office/drawing/2016/5/14/chartex" xmlns:mc="http://schemas.openxmlformats.org/markup-compatibility/2006" xmlns:aink="http://schemas.microsoft.com/office/drawing/2016/ink" xmlns:am3d="http://schemas.microsoft.com/office/drawing/2017/model3d" xmlns:o="urn:schemas-microsoft-com:office:office" xmlns:oel="http://schemas.microsoft.com/office/2019/extlst" xmlns:r="http://schemas.openxmlformats.org/officeDocument/2006/relationships" xmlns:m="http://schemas.openxmlformats.org/officeDocument/2006/math" xmlns:v="urn:schemas-microsoft-com:vml" xmlns:wp14="http://schemas.microsoft.com/office/word/2010/wordprocessingDrawing" xmlns:wp="http://schemas.openxmlformats.org/drawingml/2006/wordprocessingDrawing" xmlns:w10="urn:schemas-microsoft-com:office:word" xmlns:w="http://schemas.openxmlformats.org/wordprocessingml/2006/main" xmlns:w14="http://schemas.microsoft.com/office/word/2010/wordml" xmlns:w15="http://schemas.microsoft.com/office/word/2012/wordml" xmlns:w16cex="http://schemas.microsoft.com/office/word/2018/wordml/cex" xmlns:w16cid="http://schemas.microsoft.com/office/word/2016/wordml/cid" xmlns:w16="http://schemas.microsoft.com/office/word/2018/wordml" xmlns:w16du="http://schemas.microsoft.com/office/word/2023/wordml/word16du" xmlns:w16sdtdh="http://schemas.microsoft.com/office/word/2020/wordml/sdtdatahash" xmlns:w16sdtfl="http://schemas.microsoft.com/office/word/2024/wordml/sdtformatlock" xmlns:w16se="http://schemas.microsoft.com/office/word/2015/wordml/symex" xmlns:wpg="http://schemas.microsoft.com/office/word/2010/wordprocessingGroup" xmlns:wpi="http://schemas.microsoft.com/office/word/2010/wordprocessingInk" xmlns:wne="http://schemas.microsoft.com/office/word/2006/wordml" xmlns:wps="http://schemas.microsoft.com/office/word/2010/wordprocessingShape" mc:Ignorable="w14 w15 w16se w16cid w16 w16cex w16sdtdh w16sdtfl w16du wp14">
+  <w:endnote w:type="separator" w:id="-1">
+    <w:p>
+      <w:pPr>
+        <w:spacing w:after="0" w:line="240" w:lineRule="auto"/>
+        <w:rPr>
+          <w:rFonts w:hint="eastAsia"/>
+        </w:rPr>
+      </w:pPr>
+      <w:r>
+        <w:separator/>
+      </w:r>
+    </w:p>
+  </w:endnote>
+  <w:endnote w:type="continuationSeparator" w:id="0">
+    <w:p>
+      <w:pPr>
+        <w:spacing w:after="0" w:line="240" w:lineRule="auto"/>
+        <w:rPr>
+          <w:rFonts w:hint="eastAsia"/>
+        </w:rPr>
+      </w:pPr>
+      <w:r>
+        <w:continuationSeparator/>
+      </w:r>
+    </w:p>
+  </w:endnote>
+</w:endnotes>
+</file>
+
+<file path=word/footnotes.xml><?xml version="1.0" encoding="utf-8"?>
+<w:footnotes xmlns:wpc="http://schemas.microsoft.com/office/word/2010/wordprocessingCanvas" xmlns:cx="http://schemas.microsoft.com/office/drawing/2014/chartex" xmlns:cx1="http://schemas.microsoft.com/office/drawing/2015/9/8/chartex" xmlns:cx2="http://schemas.microsoft.com/office/drawing/2015/10/21/chartex" xmlns:cx3="http://schemas.microsoft.com/office/drawing/2016/5/9/chartex" xmlns:cx4="http://schemas.microsoft.com/office/drawing/2016/5/10/chartex" xmlns:cx5="http://schemas.microsoft.com/office/drawing/2016/5/11/chartex" xmlns:cx6="http://schemas.microsoft.com/office/drawing/2016/5/12/chartex" xmlns:cx7="http://schemas.microsoft.com/office/drawing/2016/5/13/chartex" xmlns:cx8="http://schemas.microsoft.com/office/drawing/2016/5/14/chartex" xmlns:mc="http://schemas.openxmlformats.org/markup-compatibility/2006" xmlns:aink="http://schemas.microsoft.com/office/drawing/2016/ink" xmlns:am3d="http://schemas.microsoft.com/office/drawing/2017/model3d" xmlns:o="urn:schemas-microsoft-com:office:office" xmlns:oel="http://schemas.microsoft.com/office/2019/extlst" xmlns:r="http://schemas.openxmlformats.org/officeDocument/2006/relationships" xmlns:m="http://schemas.openxmlformats.org/officeDocument/2006/math" xmlns:v="urn:schemas-microsoft-com:vml" xmlns:wp14="http://schemas.microsoft.com/office/word/2010/wordprocessingDrawing" xmlns:wp="http://schemas.openxmlformats.org/drawingml/2006/wordprocessingDrawing" xmlns:w10="urn:schemas-microsoft-com:office:word" xmlns:w="http://schemas.openxmlformats.org/wordprocessingml/2006/main" xmlns:w14="http://schemas.microsoft.com/office/word/2010/wordml" xmlns:w15="http://schemas.microsoft.com/office/word/2012/wordml" xmlns:w16cex="http://schemas.microsoft.com/office/word/2018/wordml/cex" xmlns:w16cid="http://schemas.microsoft.com/office/word/2016/wordml/cid" xmlns:w16="http://schemas.microsoft.com/office/word/2018/wordml" xmlns:w16du="http://schemas.microsoft.com/office/word/2023/wordml/word16du" xmlns:w16sdtdh="http://schemas.microsoft.com/office/word/2020/wordml/sdtdatahash" xmlns:w16sdtfl="http://schemas.microsoft.com/office/word/2024/wordml/sdtformatlock" xmlns:w16se="http://schemas.microsoft.com/office/word/2015/wordml/symex" xmlns:wpg="http://schemas.microsoft.com/office/word/2010/wordprocessingGroup" xmlns:wpi="http://schemas.microsoft.com/office/word/2010/wordprocessingInk" xmlns:wne="http://schemas.microsoft.com/office/word/2006/wordml" xmlns:wps="http://schemas.microsoft.com/office/word/2010/wordprocessingShape" mc:Ignorable="w14 w15 w16se w16cid w16 w16cex w16sdtdh w16sdtfl w16du wp14">
+  <w:footnote w:type="separator" w:id="-1">
+    <w:p>
+      <w:pPr>
+        <w:spacing w:after="0" w:line="240" w:lineRule="auto"/>
+        <w:rPr>
+          <w:rFonts w:hint="eastAsia"/>
+        </w:rPr>
+      </w:pPr>
+      <w:r>
+        <w:separator/>
+      </w:r>
+    </w:p>
+  </w:footnote>
+  <w:footnote w:type="continuationSeparator" w:id="0">
+    <w:p>
+      <w:pPr>
+        <w:spacing w:after="0" w:line="240" w:lineRule="auto"/>
+        <w:rPr>
+          <w:rFonts w:hint="eastAsia"/>
+        </w:rPr>
+      </w:pPr>
+      <w:r>
+        <w:continuationSeparator/>
+      </w:r>
+    </w:p>
+  </w:footnote>
+</w:footnotes>
 </file>
 
 <file path=word/styles.xml><?xml version="1.0" encoding="utf-8"?>
@@ -916,6 +924,7 @@
   <w:style w:type="character" w:default="1" w:styleId="a0">
     <w:name w:val="Default Paragraph Font"/>
     <w:uiPriority w:val="1"/>
+    <w:semiHidden/>
     <w:unhideWhenUsed/>
   </w:style>
   <w:style w:type="table" w:default="1" w:styleId="a1">
@@ -1230,6 +1239,92 @@
       <w:smallCaps/>
       <w:color w:val="0F4761" w:themeColor="accent1" w:themeShade="BF"/>
       <w:spacing w:val="5"/>
+    </w:rPr>
+  </w:style>
+  <w:style w:type="paragraph" w:styleId="ae">
+    <w:name w:val="header"/>
+    <w:basedOn w:val="a"/>
+    <w:link w:val="af"/>
+    <w:uiPriority w:val="99"/>
+    <w:unhideWhenUsed/>
+    <w:rsid w:val="008317B5"/>
+    <w:pPr>
+      <w:tabs>
+        <w:tab w:val="center" w:pos="4153"/>
+        <w:tab w:val="right" w:pos="8306"/>
+      </w:tabs>
+      <w:snapToGrid w:val="0"/>
+      <w:spacing w:line="240" w:lineRule="auto"/>
+      <w:jc w:val="center"/>
+    </w:pPr>
+    <w:rPr>
+      <w:sz w:val="18"/>
+      <w:szCs w:val="18"/>
+    </w:rPr>
+  </w:style>
+  <w:style w:type="character" w:customStyle="1" w:styleId="af">
+    <w:name w:val="页眉 字符"/>
+    <w:basedOn w:val="a0"/>
+    <w:link w:val="ae"/>
+    <w:uiPriority w:val="99"/>
+    <w:rsid w:val="008317B5"/>
+    <w:rPr>
+      <w:sz w:val="18"/>
+      <w:szCs w:val="18"/>
+    </w:rPr>
+  </w:style>
+  <w:style w:type="paragraph" w:styleId="af0">
+    <w:name w:val="footer"/>
+    <w:basedOn w:val="a"/>
+    <w:link w:val="af1"/>
+    <w:uiPriority w:val="99"/>
+    <w:unhideWhenUsed/>
+    <w:rsid w:val="008317B5"/>
+    <w:pPr>
+      <w:tabs>
+        <w:tab w:val="center" w:pos="4153"/>
+        <w:tab w:val="right" w:pos="8306"/>
+      </w:tabs>
+      <w:snapToGrid w:val="0"/>
+      <w:spacing w:line="240" w:lineRule="auto"/>
+    </w:pPr>
+    <w:rPr>
+      <w:sz w:val="18"/>
+      <w:szCs w:val="18"/>
+    </w:rPr>
+  </w:style>
+  <w:style w:type="character" w:customStyle="1" w:styleId="af1">
+    <w:name w:val="页脚 字符"/>
+    <w:basedOn w:val="a0"/>
+    <w:link w:val="af0"/>
+    <w:uiPriority w:val="99"/>
+    <w:rsid w:val="008317B5"/>
+    <w:rPr>
+      <w:sz w:val="18"/>
+      <w:szCs w:val="18"/>
+    </w:rPr>
+  </w:style>
+  <w:style w:type="character" w:styleId="af2">
+    <w:name w:val="Hyperlink"/>
+    <w:basedOn w:val="a0"/>
+    <w:uiPriority w:val="99"/>
+    <w:unhideWhenUsed/>
+    <w:rsid w:val="008317B5"/>
+    <w:rPr>
+      <w:color w:val="467886" w:themeColor="hyperlink"/>
+      <w:u w:val="single"/>
+    </w:rPr>
+  </w:style>
+  <w:style w:type="character" w:styleId="af3">
+    <w:name w:val="Unresolved Mention"/>
+    <w:basedOn w:val="a0"/>
+    <w:uiPriority w:val="99"/>
+    <w:semiHidden/>
+    <w:unhideWhenUsed/>
+    <w:rsid w:val="008317B5"/>
+    <w:rPr>
+      <w:color w:val="605E5C"/>
+      <w:shd w:val="clear" w:color="auto" w:fill="E1DFDD"/>
     </w:rPr>
   </w:style>
 </w:styles>

</xml_diff>